<commit_message>
Fix merge alignment and daily prepare pipeline ordering.
Rebuild company bolvanki from engineer page margins, use Word PAGE/NUMPAGES
fields for page headers, apply fonts before signature sizing, and skip
signature images in bulk photo resize.

Co-authored-by: Cursor <cursoragent@cursor.com>
</commit_message>
<xml_diff>
--- a/data/templates/Геодезический контроль.docx
+++ b/data/templates/Геодезический контроль.docx
@@ -3,44 +3,15 @@
 <w:document xmlns:wpc="http://schemas.microsoft.com/office/word/2010/wordprocessingCanvas" xmlns:cx="http://schemas.microsoft.com/office/drawing/2014/chartex" xmlns:cx1="http://schemas.microsoft.com/office/drawing/2015/9/8/chartex" xmlns:cx2="http://schemas.microsoft.com/office/drawing/2015/10/21/chartex" xmlns:cx3="http://schemas.microsoft.com/office/drawing/2016/5/9/chartex" xmlns:cx4="http://schemas.microsoft.com/office/drawing/2016/5/10/chartex" xmlns:cx5="http://schemas.microsoft.com/office/drawing/2016/5/11/chartex" xmlns:cx6="http://schemas.microsoft.com/office/drawing/2016/5/12/chartex" xmlns:cx7="http://schemas.microsoft.com/office/drawing/2016/5/13/chartex" xmlns:cx8="http://schemas.microsoft.com/office/drawing/2016/5/14/chartex" xmlns:mc="http://schemas.openxmlformats.org/markup-compatibility/2006" xmlns:aink="http://schemas.microsoft.com/office/drawing/2016/ink" xmlns:am3d="http://schemas.microsoft.com/office/drawing/2017/model3d" xmlns:o="urn:schemas-microsoft-com:office:office" xmlns:r="http://schemas.openxmlformats.org/officeDocument/2006/relationships" xmlns:m="http://schemas.openxmlformats.org/officeDocument/2006/math" xmlns:v="urn:schemas-microsoft-com:vml" xmlns:wp14="http://schemas.microsoft.com/office/word/2010/wordprocessingDrawing" xmlns:wp="http://schemas.openxmlformats.org/drawingml/2006/wordprocessingDrawing" xmlns:w10="urn:schemas-microsoft-com:office:word" xmlns:w="http://schemas.openxmlformats.org/wordprocessingml/2006/main" xmlns:w14="http://schemas.microsoft.com/office/word/2010/wordml" xmlns:w15="http://schemas.microsoft.com/office/word/2012/wordml" xmlns:w16cex="http://schemas.microsoft.com/office/word/2018/wordml/cex" xmlns:w16cid="http://schemas.microsoft.com/office/word/2016/wordml/cid" xmlns:w16="http://schemas.microsoft.com/office/word/2018/wordml" xmlns:w16se="http://schemas.microsoft.com/office/word/2015/wordml/symex" xmlns:wpg="http://schemas.microsoft.com/office/word/2010/wordprocessingGroup" xmlns:wpi="http://schemas.microsoft.com/office/word/2010/wordprocessingInk" xmlns:wne="http://schemas.microsoft.com/office/word/2006/wordml" xmlns:wps="http://schemas.microsoft.com/office/word/2010/wordprocessingShape" mc:Ignorable="w14 w15 w16se w16cid w16 w16cex wp14">
   <w:body>
     <w:p>
-      <w:pPr>
-        <w:spacing w:after="0" w:line="240" w:lineRule="auto"/>
-        <w:jc w:val="center"/>
-        <w:rPr>
-          <w:rFonts w:ascii="Times New Roman" w:hAnsi="Times New Roman" w:cs="Times New Roman"/>
-          <w:b/>
-          <w:sz w:val="20"/>
-          <w:szCs w:val="20"/>
-        </w:rPr>
-      </w:pPr>
       <w:r>
-        <w:rPr>
-          <w:rFonts w:ascii="Times New Roman" w:hAnsi="Times New Roman" w:cs="Times New Roman"/>
-          <w:b/>
-          <w:sz w:val="20"/>
-          <w:szCs w:val="20"/>
-        </w:rPr>
         <w:t xml:space="preserve">Отчёт строительного контроля по Геодезическому контролю за </w:t>
       </w:r>
-      <w:bookmarkStart w:id="0" w:name="_GoBack"/>
-      <w:bookmarkEnd w:id="0"/>
     </w:p>
-    <w:p>
-      <w:pPr>
-        <w:spacing w:after="0" w:line="240" w:lineRule="auto"/>
-        <w:jc w:val="center"/>
-        <w:rPr>
-          <w:rFonts w:ascii="Times New Roman" w:hAnsi="Times New Roman" w:cs="Times New Roman"/>
-          <w:bCs/>
-          <w:sz w:val="20"/>
-          <w:szCs w:val="20"/>
-        </w:rPr>
-      </w:pPr>
-    </w:p>
+    <w:p/>
     <w:sectPr>
       <w:headerReference w:type="default" r:id="rId8"/>
       <w:pgSz w:w="11906" w:h="16838"/>
-      <w:pgMar w:top="1843" w:right="567" w:bottom="567" w:left="1134" w:header="284" w:footer="709" w:gutter="0"/>
+      <w:pgMar w:top="284" w:right="567" w:bottom="567" w:left="1134" w:header="284" w:footer="709" w:gutter="0"/>
       <w:cols w:space="708"/>
       <w:docGrid w:linePitch="360"/>
     </w:sectPr>
@@ -100,413 +71,6 @@
 
 <file path=word/header1.xml><?xml version="1.0" encoding="utf-8"?>
 <w:hdr xmlns:wpc="http://schemas.microsoft.com/office/word/2010/wordprocessingCanvas" xmlns:cx="http://schemas.microsoft.com/office/drawing/2014/chartex" xmlns:cx1="http://schemas.microsoft.com/office/drawing/2015/9/8/chartex" xmlns:cx2="http://schemas.microsoft.com/office/drawing/2015/10/21/chartex" xmlns:cx3="http://schemas.microsoft.com/office/drawing/2016/5/9/chartex" xmlns:cx4="http://schemas.microsoft.com/office/drawing/2016/5/10/chartex" xmlns:cx5="http://schemas.microsoft.com/office/drawing/2016/5/11/chartex" xmlns:cx6="http://schemas.microsoft.com/office/drawing/2016/5/12/chartex" xmlns:cx7="http://schemas.microsoft.com/office/drawing/2016/5/13/chartex" xmlns:cx8="http://schemas.microsoft.com/office/drawing/2016/5/14/chartex" xmlns:mc="http://schemas.openxmlformats.org/markup-compatibility/2006" xmlns:aink="http://schemas.microsoft.com/office/drawing/2016/ink" xmlns:am3d="http://schemas.microsoft.com/office/drawing/2017/model3d" xmlns:o="urn:schemas-microsoft-com:office:office" xmlns:r="http://schemas.openxmlformats.org/officeDocument/2006/relationships" xmlns:m="http://schemas.openxmlformats.org/officeDocument/2006/math" xmlns:v="urn:schemas-microsoft-com:vml" xmlns:wp14="http://schemas.microsoft.com/office/word/2010/wordprocessingDrawing" xmlns:wp="http://schemas.openxmlformats.org/drawingml/2006/wordprocessingDrawing" xmlns:w10="urn:schemas-microsoft-com:office:word" xmlns:w="http://schemas.openxmlformats.org/wordprocessingml/2006/main" xmlns:w14="http://schemas.microsoft.com/office/word/2010/wordml" xmlns:w15="http://schemas.microsoft.com/office/word/2012/wordml" xmlns:w16cex="http://schemas.microsoft.com/office/word/2018/wordml/cex" xmlns:w16cid="http://schemas.microsoft.com/office/word/2016/wordml/cid" xmlns:w16="http://schemas.microsoft.com/office/word/2018/wordml" xmlns:w16se="http://schemas.microsoft.com/office/word/2015/wordml/symex" xmlns:wpg="http://schemas.microsoft.com/office/word/2010/wordprocessingGroup" xmlns:wpi="http://schemas.microsoft.com/office/word/2010/wordprocessingInk" xmlns:wne="http://schemas.microsoft.com/office/word/2006/wordml" xmlns:wps="http://schemas.microsoft.com/office/word/2010/wordprocessingShape" mc:Ignorable="w14 w15 w16se w16cid w16 w16cex wp14">
-  <w:tbl>
-    <w:tblPr>
-      <w:tblStyle w:val="ab"/>
-      <w:tblW w:w="10586" w:type="dxa"/>
-      <w:tblInd w:w="-284" w:type="dxa"/>
-      <w:tblBorders>
-        <w:top w:val="none" w:sz="0" w:space="0" w:color="auto"/>
-        <w:left w:val="none" w:sz="0" w:space="0" w:color="auto"/>
-        <w:bottom w:val="none" w:sz="0" w:space="0" w:color="auto"/>
-        <w:right w:val="none" w:sz="0" w:space="0" w:color="auto"/>
-        <w:insideH w:val="none" w:sz="0" w:space="0" w:color="auto"/>
-        <w:insideV w:val="none" w:sz="0" w:space="0" w:color="auto"/>
-      </w:tblBorders>
-      <w:tblCellMar>
-        <w:left w:w="0" w:type="dxa"/>
-        <w:right w:w="0" w:type="dxa"/>
-      </w:tblCellMar>
-      <w:tblLook w:val="04A0" w:firstRow="1" w:lastRow="0" w:firstColumn="1" w:lastColumn="0" w:noHBand="0" w:noVBand="1"/>
-    </w:tblPr>
-    <w:tblGrid>
-      <w:gridCol w:w="1747"/>
-      <w:gridCol w:w="1893"/>
-      <w:gridCol w:w="1205"/>
-      <w:gridCol w:w="1068"/>
-      <w:gridCol w:w="1558"/>
-      <w:gridCol w:w="3211"/>
-    </w:tblGrid>
-    <w:tr>
-      <w:trPr>
-        <w:trHeight w:val="300"/>
-      </w:trPr>
-      <w:tc>
-        <w:tcPr>
-          <w:tcW w:w="1731" w:type="dxa"/>
-          <w:noWrap/>
-          <w:hideMark/>
-        </w:tcPr>
-        <w:p>
-          <w:pPr>
-            <w:rPr>
-              <w:rFonts w:ascii="Times New Roman" w:hAnsi="Times New Roman"/>
-              <w:sz w:val="20"/>
-              <w:szCs w:val="20"/>
-            </w:rPr>
-          </w:pPr>
-          <w:r>
-            <w:rPr>
-              <w:rFonts w:ascii="Times New Roman" w:hAnsi="Times New Roman"/>
-              <w:sz w:val="20"/>
-              <w:szCs w:val="20"/>
-            </w:rPr>
-            <w:t>Заказчик:</w:t>
-          </w:r>
-        </w:p>
-      </w:tc>
-      <w:tc>
-        <w:tcPr>
-          <w:tcW w:w="1877" w:type="dxa"/>
-          <w:noWrap/>
-          <w:hideMark/>
-        </w:tcPr>
-        <w:p>
-          <w:pPr>
-            <w:rPr>
-              <w:rFonts w:ascii="Times New Roman" w:hAnsi="Times New Roman"/>
-              <w:sz w:val="20"/>
-              <w:szCs w:val="20"/>
-            </w:rPr>
-          </w:pPr>
-          <w:r>
-            <w:rPr>
-              <w:rFonts w:ascii="Times New Roman" w:hAnsi="Times New Roman"/>
-              <w:sz w:val="20"/>
-              <w:szCs w:val="20"/>
-            </w:rPr>
-            <w:t>ООО "СПД"</w:t>
-          </w:r>
-        </w:p>
-      </w:tc>
-      <w:tc>
-        <w:tcPr>
-          <w:tcW w:w="1189" w:type="dxa"/>
-          <w:noWrap/>
-          <w:hideMark/>
-        </w:tcPr>
-        <w:p>
-          <w:pPr>
-            <w:jc w:val="center"/>
-            <w:rPr>
-              <w:rFonts w:ascii="Times New Roman" w:hAnsi="Times New Roman"/>
-              <w:sz w:val="20"/>
-              <w:szCs w:val="20"/>
-            </w:rPr>
-          </w:pPr>
-          <w:r>
-            <w:rPr>
-              <w:rFonts w:ascii="Times New Roman" w:hAnsi="Times New Roman"/>
-              <w:sz w:val="20"/>
-              <w:szCs w:val="20"/>
-            </w:rPr>
-            <w:t> </w:t>
-          </w:r>
-        </w:p>
-      </w:tc>
-      <w:tc>
-        <w:tcPr>
-          <w:tcW w:w="1052" w:type="dxa"/>
-          <w:noWrap/>
-          <w:hideMark/>
-        </w:tcPr>
-        <w:p>
-          <w:pPr>
-            <w:jc w:val="center"/>
-            <w:rPr>
-              <w:rFonts w:ascii="Times New Roman" w:hAnsi="Times New Roman"/>
-              <w:sz w:val="20"/>
-              <w:szCs w:val="20"/>
-            </w:rPr>
-          </w:pPr>
-          <w:r>
-            <w:rPr>
-              <w:rFonts w:ascii="Times New Roman" w:hAnsi="Times New Roman"/>
-              <w:sz w:val="20"/>
-              <w:szCs w:val="20"/>
-            </w:rPr>
-            <w:t> </w:t>
-          </w:r>
-        </w:p>
-      </w:tc>
-      <w:tc>
-        <w:tcPr>
-          <w:tcW w:w="1542" w:type="dxa"/>
-          <w:noWrap/>
-          <w:hideMark/>
-        </w:tcPr>
-        <w:p>
-          <w:pPr>
-            <w:jc w:val="center"/>
-            <w:rPr>
-              <w:rFonts w:ascii="Times New Roman" w:hAnsi="Times New Roman"/>
-              <w:sz w:val="20"/>
-              <w:szCs w:val="20"/>
-            </w:rPr>
-          </w:pPr>
-          <w:r>
-            <w:rPr>
-              <w:rFonts w:ascii="Times New Roman" w:hAnsi="Times New Roman"/>
-              <w:sz w:val="20"/>
-              <w:szCs w:val="20"/>
-            </w:rPr>
-            <w:t> </w:t>
-          </w:r>
-        </w:p>
-      </w:tc>
-      <w:tc>
-        <w:tcPr>
-          <w:tcW w:w="3195" w:type="dxa"/>
-          <w:noWrap/>
-          <w:hideMark/>
-        </w:tcPr>
-        <w:p>
-          <w:pPr>
-            <w:jc w:val="right"/>
-            <w:rPr>
-              <w:rFonts w:ascii="Times New Roman" w:hAnsi="Times New Roman"/>
-              <w:sz w:val="20"/>
-              <w:szCs w:val="20"/>
-            </w:rPr>
-          </w:pPr>
-          <w:r>
-            <w:rPr>
-              <w:rFonts w:ascii="Times New Roman" w:hAnsi="Times New Roman"/>
-              <w:sz w:val="20"/>
-              <w:szCs w:val="20"/>
-            </w:rPr>
-            <w:t>Приложение № 16</w:t>
-          </w:r>
-        </w:p>
-      </w:tc>
-    </w:tr>
-    <w:tr>
-      <w:trPr>
-        <w:trHeight w:val="300"/>
-      </w:trPr>
-      <w:tc>
-        <w:tcPr>
-          <w:tcW w:w="1731" w:type="dxa"/>
-          <w:noWrap/>
-          <w:hideMark/>
-        </w:tcPr>
-        <w:p>
-          <w:pPr>
-            <w:rPr>
-              <w:rFonts w:ascii="Times New Roman" w:hAnsi="Times New Roman"/>
-              <w:sz w:val="20"/>
-              <w:szCs w:val="20"/>
-            </w:rPr>
-          </w:pPr>
-          <w:r>
-            <w:rPr>
-              <w:rFonts w:ascii="Times New Roman" w:hAnsi="Times New Roman"/>
-              <w:sz w:val="20"/>
-              <w:szCs w:val="20"/>
-            </w:rPr>
-            <w:t xml:space="preserve">Исполнитель: </w:t>
-          </w:r>
-        </w:p>
-      </w:tc>
-      <w:tc>
-        <w:tcPr>
-          <w:tcW w:w="1877" w:type="dxa"/>
-          <w:noWrap/>
-          <w:hideMark/>
-        </w:tcPr>
-        <w:p>
-          <w:pPr>
-            <w:rPr>
-              <w:rFonts w:ascii="Times New Roman" w:hAnsi="Times New Roman"/>
-              <w:sz w:val="20"/>
-              <w:szCs w:val="20"/>
-            </w:rPr>
-          </w:pPr>
-          <w:r>
-            <w:rPr>
-              <w:rFonts w:ascii="Times New Roman" w:hAnsi="Times New Roman"/>
-              <w:sz w:val="20"/>
-              <w:szCs w:val="20"/>
-            </w:rPr>
-            <w:t>ООО "Техресурс"</w:t>
-          </w:r>
-        </w:p>
-      </w:tc>
-      <w:tc>
-        <w:tcPr>
-          <w:tcW w:w="1189" w:type="dxa"/>
-          <w:noWrap/>
-          <w:hideMark/>
-        </w:tcPr>
-        <w:p>
-          <w:pPr>
-            <w:jc w:val="center"/>
-            <w:rPr>
-              <w:rFonts w:ascii="Times New Roman" w:hAnsi="Times New Roman"/>
-              <w:sz w:val="20"/>
-              <w:szCs w:val="20"/>
-            </w:rPr>
-          </w:pPr>
-          <w:r>
-            <w:rPr>
-              <w:rFonts w:ascii="Times New Roman" w:hAnsi="Times New Roman"/>
-              <w:sz w:val="20"/>
-              <w:szCs w:val="20"/>
-            </w:rPr>
-            <w:t> </w:t>
-          </w:r>
-        </w:p>
-      </w:tc>
-      <w:tc>
-        <w:tcPr>
-          <w:tcW w:w="1052" w:type="dxa"/>
-          <w:noWrap/>
-          <w:hideMark/>
-        </w:tcPr>
-        <w:p>
-          <w:pPr>
-            <w:jc w:val="center"/>
-            <w:rPr>
-              <w:rFonts w:ascii="Times New Roman" w:hAnsi="Times New Roman"/>
-              <w:sz w:val="20"/>
-              <w:szCs w:val="20"/>
-            </w:rPr>
-          </w:pPr>
-          <w:r>
-            <w:rPr>
-              <w:noProof/>
-            </w:rPr>
-            <w:drawing>
-              <wp:anchor distT="0" distB="0" distL="114300" distR="114300" simplePos="0" relativeHeight="251658752" behindDoc="0" locked="0" layoutInCell="1" allowOverlap="1" wp14:anchorId="52C3F301" wp14:editId="524FABBD">
-                <wp:simplePos x="0" y="0"/>
-                <wp:positionH relativeFrom="column">
-                  <wp:posOffset>-602814</wp:posOffset>
-                </wp:positionH>
-                <wp:positionV relativeFrom="paragraph">
-                  <wp:posOffset>-140417</wp:posOffset>
-                </wp:positionV>
-                <wp:extent cx="1929064" cy="876300"/>
-                <wp:effectExtent l="0" t="0" r="0" b="0"/>
-                <wp:wrapNone/>
-                <wp:docPr id="1351832037" name="Рисунок 9">
-                  <a:extLst xmlns:a="http://schemas.openxmlformats.org/drawingml/2006/main">
-                    <a:ext uri="{FF2B5EF4-FFF2-40B4-BE49-F238E27FC236}">
-                      <a16:creationId xmlns:a16="http://schemas.microsoft.com/office/drawing/2014/main" id="{95163124-6A06-F45E-ADD6-63EEFA42AA28}"/>
-                    </a:ext>
-                  </a:extLst>
-                </wp:docPr>
-                <wp:cNvGraphicFramePr>
-                  <a:graphicFrameLocks xmlns:a="http://schemas.openxmlformats.org/drawingml/2006/main" noChangeAspect="1"/>
-                </wp:cNvGraphicFramePr>
-                <a:graphic xmlns:a="http://schemas.openxmlformats.org/drawingml/2006/main">
-                  <a:graphicData uri="http://schemas.openxmlformats.org/drawingml/2006/picture">
-                    <pic:pic xmlns:pic="http://schemas.openxmlformats.org/drawingml/2006/picture">
-                      <pic:nvPicPr>
-                        <pic:cNvPr id="10" name="Рисунок 9">
-                          <a:extLst>
-                            <a:ext uri="{FF2B5EF4-FFF2-40B4-BE49-F238E27FC236}">
-                              <a16:creationId xmlns:a16="http://schemas.microsoft.com/office/drawing/2014/main" id="{95163124-6A06-F45E-ADD6-63EEFA42AA28}"/>
-                            </a:ext>
-                          </a:extLst>
-                        </pic:cNvPr>
-                        <pic:cNvPicPr>
-                          <a:picLocks noChangeAspect="1"/>
-                        </pic:cNvPicPr>
-                      </pic:nvPicPr>
-                      <pic:blipFill>
-                        <a:blip r:embed="rId1" cstate="email">
-                          <a:extLst>
-                            <a:ext uri="{28A0092B-C50C-407E-A947-70E740481C1C}">
-                              <a14:useLocalDpi xmlns:a14="http://schemas.microsoft.com/office/drawing/2010/main" val="0"/>
-                            </a:ext>
-                          </a:extLst>
-                        </a:blip>
-                        <a:srcRect/>
-                        <a:stretch>
-                          <a:fillRect/>
-                        </a:stretch>
-                      </pic:blipFill>
-                      <pic:spPr bwMode="auto">
-                        <a:xfrm>
-                          <a:off x="0" y="0"/>
-                          <a:ext cx="1929064" cy="876300"/>
-                        </a:xfrm>
-                        <a:prstGeom prst="rect">
-                          <a:avLst/>
-                        </a:prstGeom>
-                        <a:noFill/>
-                        <a:ln>
-                          <a:noFill/>
-                        </a:ln>
-                      </pic:spPr>
-                    </pic:pic>
-                  </a:graphicData>
-                </a:graphic>
-              </wp:anchor>
-            </w:drawing>
-          </w:r>
-          <w:r>
-            <w:rPr>
-              <w:rFonts w:ascii="Times New Roman" w:hAnsi="Times New Roman"/>
-              <w:sz w:val="20"/>
-              <w:szCs w:val="20"/>
-            </w:rPr>
-            <w:t> </w:t>
-          </w:r>
-        </w:p>
-      </w:tc>
-      <w:tc>
-        <w:tcPr>
-          <w:tcW w:w="1542" w:type="dxa"/>
-          <w:noWrap/>
-          <w:hideMark/>
-        </w:tcPr>
-        <w:p>
-          <w:pPr>
-            <w:jc w:val="center"/>
-            <w:rPr>
-              <w:rFonts w:ascii="Times New Roman" w:hAnsi="Times New Roman"/>
-              <w:sz w:val="20"/>
-              <w:szCs w:val="20"/>
-            </w:rPr>
-          </w:pPr>
-          <w:r>
-            <w:rPr>
-              <w:rFonts w:ascii="Times New Roman" w:hAnsi="Times New Roman"/>
-              <w:sz w:val="20"/>
-              <w:szCs w:val="20"/>
-            </w:rPr>
-            <w:t> </w:t>
-          </w:r>
-        </w:p>
-      </w:tc>
-      <w:tc>
-        <w:tcPr>
-          <w:tcW w:w="3195" w:type="dxa"/>
-          <w:noWrap/>
-          <w:hideMark/>
-        </w:tcPr>
-        <w:p>
-          <w:pPr>
-            <w:jc w:val="right"/>
-            <w:rPr>
-              <w:rFonts w:ascii="Times New Roman" w:hAnsi="Times New Roman"/>
-              <w:sz w:val="20"/>
-              <w:szCs w:val="20"/>
-            </w:rPr>
-          </w:pPr>
-          <w:r>
-            <w:rPr>
-              <w:rFonts w:ascii="Times New Roman" w:hAnsi="Times New Roman"/>
-              <w:sz w:val="20"/>
-              <w:szCs w:val="20"/>
-            </w:rPr>
-            <w:t>к Договору № MOS/25/0008</w:t>
-          </w:r>
-        </w:p>
-      </w:tc>
-    </w:tr>
-  </w:tbl>
   <w:p>
     <w:pPr>
       <w:spacing w:after="0"/>
@@ -702,6 +266,96 @@
     </w:lvl>
   </w:abstractNum>
   <w:abstractNum w:abstractNumId="2" w15:restartNumberingAfterBreak="0">
+    <w:nsid w:val="0D7A28D5"/>
+    <w:multiLevelType w:val="hybridMultilevel"/>
+    <w:tmpl w:val="95D21128"/>
+    <w:lvl w:ilvl="0" w:tplc="56DCA94E">
+      <w:start w:val="1"/>
+      <w:numFmt w:val="decimal"/>
+      <w:lvlText w:val="%1."/>
+      <w:lvlJc w:val="left"/>
+      <w:pPr>
+        <w:ind w:left="720" w:hanging="360"/>
+      </w:pPr>
+      <w:rPr>
+        <w:rFonts w:hint="default"/>
+        <w:b/>
+      </w:rPr>
+    </w:lvl>
+    <w:lvl w:ilvl="1" w:tplc="04190019" w:tentative="1">
+      <w:start w:val="1"/>
+      <w:numFmt w:val="lowerLetter"/>
+      <w:lvlText w:val="%2."/>
+      <w:lvlJc w:val="left"/>
+      <w:pPr>
+        <w:ind w:left="1440" w:hanging="360"/>
+      </w:pPr>
+    </w:lvl>
+    <w:lvl w:ilvl="2" w:tplc="0419001B" w:tentative="1">
+      <w:start w:val="1"/>
+      <w:numFmt w:val="lowerRoman"/>
+      <w:lvlText w:val="%3."/>
+      <w:lvlJc w:val="right"/>
+      <w:pPr>
+        <w:ind w:left="2160" w:hanging="180"/>
+      </w:pPr>
+    </w:lvl>
+    <w:lvl w:ilvl="3" w:tplc="0419000F" w:tentative="1">
+      <w:start w:val="1"/>
+      <w:numFmt w:val="decimal"/>
+      <w:lvlText w:val="%4."/>
+      <w:lvlJc w:val="left"/>
+      <w:pPr>
+        <w:ind w:left="2880" w:hanging="360"/>
+      </w:pPr>
+    </w:lvl>
+    <w:lvl w:ilvl="4" w:tplc="04190019" w:tentative="1">
+      <w:start w:val="1"/>
+      <w:numFmt w:val="lowerLetter"/>
+      <w:lvlText w:val="%5."/>
+      <w:lvlJc w:val="left"/>
+      <w:pPr>
+        <w:ind w:left="3600" w:hanging="360"/>
+      </w:pPr>
+    </w:lvl>
+    <w:lvl w:ilvl="5" w:tplc="0419001B" w:tentative="1">
+      <w:start w:val="1"/>
+      <w:numFmt w:val="lowerRoman"/>
+      <w:lvlText w:val="%6."/>
+      <w:lvlJc w:val="right"/>
+      <w:pPr>
+        <w:ind w:left="4320" w:hanging="180"/>
+      </w:pPr>
+    </w:lvl>
+    <w:lvl w:ilvl="6" w:tplc="0419000F" w:tentative="1">
+      <w:start w:val="1"/>
+      <w:numFmt w:val="decimal"/>
+      <w:lvlText w:val="%7."/>
+      <w:lvlJc w:val="left"/>
+      <w:pPr>
+        <w:ind w:left="5040" w:hanging="360"/>
+      </w:pPr>
+    </w:lvl>
+    <w:lvl w:ilvl="7" w:tplc="04190019" w:tentative="1">
+      <w:start w:val="1"/>
+      <w:numFmt w:val="lowerLetter"/>
+      <w:lvlText w:val="%8."/>
+      <w:lvlJc w:val="left"/>
+      <w:pPr>
+        <w:ind w:left="5760" w:hanging="360"/>
+      </w:pPr>
+    </w:lvl>
+    <w:lvl w:ilvl="8" w:tplc="0419001B" w:tentative="1">
+      <w:start w:val="1"/>
+      <w:numFmt w:val="lowerRoman"/>
+      <w:lvlText w:val="%9."/>
+      <w:lvlJc w:val="right"/>
+      <w:pPr>
+        <w:ind w:left="6480" w:hanging="180"/>
+      </w:pPr>
+    </w:lvl>
+  </w:abstractNum>
+  <w:abstractNum w:abstractNumId="3" w15:restartNumberingAfterBreak="0">
     <w:nsid w:val="0FAC65EF"/>
     <w:multiLevelType w:val="hybridMultilevel"/>
     <w:tmpl w:val="785CF232"/>
@@ -790,7 +444,7 @@
       </w:pPr>
     </w:lvl>
   </w:abstractNum>
-  <w:abstractNum w:abstractNumId="3" w15:restartNumberingAfterBreak="0">
+  <w:abstractNum w:abstractNumId="4" w15:restartNumberingAfterBreak="0">
     <w:nsid w:val="15825FF9"/>
     <w:multiLevelType w:val="hybridMultilevel"/>
     <w:tmpl w:val="25FEE7FC"/>
@@ -879,7 +533,7 @@
       </w:pPr>
     </w:lvl>
   </w:abstractNum>
-  <w:abstractNum w:abstractNumId="4" w15:restartNumberingAfterBreak="0">
+  <w:abstractNum w:abstractNumId="5" w15:restartNumberingAfterBreak="0">
     <w:nsid w:val="1BFB2D00"/>
     <w:multiLevelType w:val="hybridMultilevel"/>
     <w:tmpl w:val="0CB602D4"/>
@@ -970,7 +624,7 @@
       </w:pPr>
     </w:lvl>
   </w:abstractNum>
-  <w:abstractNum w:abstractNumId="5" w15:restartNumberingAfterBreak="0">
+  <w:abstractNum w:abstractNumId="6" w15:restartNumberingAfterBreak="0">
     <w:nsid w:val="252116D5"/>
     <w:multiLevelType w:val="hybridMultilevel"/>
     <w:tmpl w:val="9C7E3A28"/>
@@ -1059,7 +713,7 @@
       </w:pPr>
     </w:lvl>
   </w:abstractNum>
-  <w:abstractNum w:abstractNumId="6" w15:restartNumberingAfterBreak="0">
+  <w:abstractNum w:abstractNumId="7" w15:restartNumberingAfterBreak="0">
     <w:nsid w:val="29985E31"/>
     <w:multiLevelType w:val="hybridMultilevel"/>
     <w:tmpl w:val="F18C3C9E"/>
@@ -1148,7 +802,7 @@
       </w:pPr>
     </w:lvl>
   </w:abstractNum>
-  <w:abstractNum w:abstractNumId="7" w15:restartNumberingAfterBreak="0">
+  <w:abstractNum w:abstractNumId="8" w15:restartNumberingAfterBreak="0">
     <w:nsid w:val="2BA22891"/>
     <w:multiLevelType w:val="hybridMultilevel"/>
     <w:tmpl w:val="DA44EF50"/>
@@ -1237,7 +891,7 @@
       </w:pPr>
     </w:lvl>
   </w:abstractNum>
-  <w:abstractNum w:abstractNumId="8" w15:restartNumberingAfterBreak="0">
+  <w:abstractNum w:abstractNumId="9" w15:restartNumberingAfterBreak="0">
     <w:nsid w:val="2DA83EAA"/>
     <w:multiLevelType w:val="hybridMultilevel"/>
     <w:tmpl w:val="785CF232"/>
@@ -1326,7 +980,7 @@
       </w:pPr>
     </w:lvl>
   </w:abstractNum>
-  <w:abstractNum w:abstractNumId="9" w15:restartNumberingAfterBreak="0">
+  <w:abstractNum w:abstractNumId="10" w15:restartNumberingAfterBreak="0">
     <w:nsid w:val="343A4F11"/>
     <w:multiLevelType w:val="hybridMultilevel"/>
     <w:tmpl w:val="67BC3878"/>
@@ -1415,7 +1069,7 @@
       </w:pPr>
     </w:lvl>
   </w:abstractNum>
-  <w:abstractNum w:abstractNumId="10" w15:restartNumberingAfterBreak="0">
+  <w:abstractNum w:abstractNumId="11" w15:restartNumberingAfterBreak="0">
     <w:nsid w:val="35605315"/>
     <w:multiLevelType w:val="hybridMultilevel"/>
     <w:tmpl w:val="785CF232"/>
@@ -1504,7 +1158,7 @@
       </w:pPr>
     </w:lvl>
   </w:abstractNum>
-  <w:abstractNum w:abstractNumId="11" w15:restartNumberingAfterBreak="0">
+  <w:abstractNum w:abstractNumId="12" w15:restartNumberingAfterBreak="0">
     <w:nsid w:val="3704479B"/>
     <w:multiLevelType w:val="hybridMultilevel"/>
     <w:tmpl w:val="3E9C37F8"/>
@@ -1593,7 +1247,7 @@
       </w:pPr>
     </w:lvl>
   </w:abstractNum>
-  <w:abstractNum w:abstractNumId="12" w15:restartNumberingAfterBreak="0">
+  <w:abstractNum w:abstractNumId="13" w15:restartNumberingAfterBreak="0">
     <w:nsid w:val="37305FAE"/>
     <w:multiLevelType w:val="hybridMultilevel"/>
     <w:tmpl w:val="0FF8DCE6"/>
@@ -1683,7 +1337,7 @@
       </w:pPr>
     </w:lvl>
   </w:abstractNum>
-  <w:abstractNum w:abstractNumId="13" w15:restartNumberingAfterBreak="0">
+  <w:abstractNum w:abstractNumId="14" w15:restartNumberingAfterBreak="0">
     <w:nsid w:val="38FF472C"/>
     <w:multiLevelType w:val="hybridMultilevel"/>
     <w:tmpl w:val="06F085A0"/>
@@ -1772,7 +1426,7 @@
       </w:pPr>
     </w:lvl>
   </w:abstractNum>
-  <w:abstractNum w:abstractNumId="14" w15:restartNumberingAfterBreak="0">
+  <w:abstractNum w:abstractNumId="15" w15:restartNumberingAfterBreak="0">
     <w:nsid w:val="39EA16F8"/>
     <w:multiLevelType w:val="hybridMultilevel"/>
     <w:tmpl w:val="E75AEF56"/>
@@ -1861,7 +1515,7 @@
       </w:pPr>
     </w:lvl>
   </w:abstractNum>
-  <w:abstractNum w:abstractNumId="15" w15:restartNumberingAfterBreak="0">
+  <w:abstractNum w:abstractNumId="16" w15:restartNumberingAfterBreak="0">
     <w:nsid w:val="3FF30ED6"/>
     <w:multiLevelType w:val="hybridMultilevel"/>
     <w:tmpl w:val="E95401DA"/>
@@ -1950,7 +1604,7 @@
       </w:pPr>
     </w:lvl>
   </w:abstractNum>
-  <w:abstractNum w:abstractNumId="16" w15:restartNumberingAfterBreak="0">
+  <w:abstractNum w:abstractNumId="17" w15:restartNumberingAfterBreak="0">
     <w:nsid w:val="4193788B"/>
     <w:multiLevelType w:val="hybridMultilevel"/>
     <w:tmpl w:val="E95401DA"/>
@@ -2039,7 +1693,7 @@
       </w:pPr>
     </w:lvl>
   </w:abstractNum>
-  <w:abstractNum w:abstractNumId="17" w15:restartNumberingAfterBreak="0">
+  <w:abstractNum w:abstractNumId="18" w15:restartNumberingAfterBreak="0">
     <w:nsid w:val="4F7B562C"/>
     <w:multiLevelType w:val="hybridMultilevel"/>
     <w:tmpl w:val="785CF232"/>
@@ -2128,7 +1782,7 @@
       </w:pPr>
     </w:lvl>
   </w:abstractNum>
-  <w:abstractNum w:abstractNumId="18" w15:restartNumberingAfterBreak="0">
+  <w:abstractNum w:abstractNumId="19" w15:restartNumberingAfterBreak="0">
     <w:nsid w:val="5286366B"/>
     <w:multiLevelType w:val="hybridMultilevel"/>
     <w:tmpl w:val="7FD2070C"/>
@@ -2217,7 +1871,7 @@
       </w:pPr>
     </w:lvl>
   </w:abstractNum>
-  <w:abstractNum w:abstractNumId="19" w15:restartNumberingAfterBreak="0">
+  <w:abstractNum w:abstractNumId="20" w15:restartNumberingAfterBreak="0">
     <w:nsid w:val="53C62639"/>
     <w:multiLevelType w:val="hybridMultilevel"/>
     <w:tmpl w:val="E95401DA"/>
@@ -2306,7 +1960,7 @@
       </w:pPr>
     </w:lvl>
   </w:abstractNum>
-  <w:abstractNum w:abstractNumId="20" w15:restartNumberingAfterBreak="0">
+  <w:abstractNum w:abstractNumId="21" w15:restartNumberingAfterBreak="0">
     <w:nsid w:val="5695598B"/>
     <w:multiLevelType w:val="hybridMultilevel"/>
     <w:tmpl w:val="688C552E"/>
@@ -2396,7 +2050,7 @@
       </w:pPr>
     </w:lvl>
   </w:abstractNum>
-  <w:abstractNum w:abstractNumId="21" w15:restartNumberingAfterBreak="0">
+  <w:abstractNum w:abstractNumId="22" w15:restartNumberingAfterBreak="0">
     <w:nsid w:val="57A33FE1"/>
     <w:multiLevelType w:val="hybridMultilevel"/>
     <w:tmpl w:val="785CF232"/>
@@ -2485,7 +2139,7 @@
       </w:pPr>
     </w:lvl>
   </w:abstractNum>
-  <w:abstractNum w:abstractNumId="22" w15:restartNumberingAfterBreak="0">
+  <w:abstractNum w:abstractNumId="23" w15:restartNumberingAfterBreak="0">
     <w:nsid w:val="57A52794"/>
     <w:multiLevelType w:val="hybridMultilevel"/>
     <w:tmpl w:val="BA5ABE36"/>
@@ -2574,7 +2228,7 @@
       </w:pPr>
     </w:lvl>
   </w:abstractNum>
-  <w:abstractNum w:abstractNumId="23" w15:restartNumberingAfterBreak="0">
+  <w:abstractNum w:abstractNumId="24" w15:restartNumberingAfterBreak="0">
     <w:nsid w:val="5FE35946"/>
     <w:multiLevelType w:val="hybridMultilevel"/>
     <w:tmpl w:val="785CF232"/>
@@ -2663,7 +2317,7 @@
       </w:pPr>
     </w:lvl>
   </w:abstractNum>
-  <w:abstractNum w:abstractNumId="24" w15:restartNumberingAfterBreak="0">
+  <w:abstractNum w:abstractNumId="25" w15:restartNumberingAfterBreak="0">
     <w:nsid w:val="603351E3"/>
     <w:multiLevelType w:val="hybridMultilevel"/>
     <w:tmpl w:val="96B2C9C2"/>
@@ -2753,7 +2407,7 @@
       </w:pPr>
     </w:lvl>
   </w:abstractNum>
-  <w:abstractNum w:abstractNumId="25" w15:restartNumberingAfterBreak="0">
+  <w:abstractNum w:abstractNumId="26" w15:restartNumberingAfterBreak="0">
     <w:nsid w:val="66C43830"/>
     <w:multiLevelType w:val="hybridMultilevel"/>
     <w:tmpl w:val="785CF232"/>
@@ -2842,7 +2496,7 @@
       </w:pPr>
     </w:lvl>
   </w:abstractNum>
-  <w:abstractNum w:abstractNumId="26" w15:restartNumberingAfterBreak="0">
+  <w:abstractNum w:abstractNumId="27" w15:restartNumberingAfterBreak="0">
     <w:nsid w:val="6CA824FA"/>
     <w:multiLevelType w:val="hybridMultilevel"/>
     <w:tmpl w:val="68D8C660"/>
@@ -2931,7 +2585,7 @@
       </w:pPr>
     </w:lvl>
   </w:abstractNum>
-  <w:abstractNum w:abstractNumId="27" w15:restartNumberingAfterBreak="0">
+  <w:abstractNum w:abstractNumId="28" w15:restartNumberingAfterBreak="0">
     <w:nsid w:val="70542362"/>
     <w:multiLevelType w:val="hybridMultilevel"/>
     <w:tmpl w:val="3E9C37F8"/>
@@ -3020,7 +2674,7 @@
       </w:pPr>
     </w:lvl>
   </w:abstractNum>
-  <w:abstractNum w:abstractNumId="28" w15:restartNumberingAfterBreak="0">
+  <w:abstractNum w:abstractNumId="29" w15:restartNumberingAfterBreak="0">
     <w:nsid w:val="75146021"/>
     <w:multiLevelType w:val="hybridMultilevel"/>
     <w:tmpl w:val="AEB619B4"/>
@@ -3109,7 +2763,7 @@
       </w:pPr>
     </w:lvl>
   </w:abstractNum>
-  <w:abstractNum w:abstractNumId="29" w15:restartNumberingAfterBreak="0">
+  <w:abstractNum w:abstractNumId="30" w15:restartNumberingAfterBreak="0">
     <w:nsid w:val="7BE02318"/>
     <w:multiLevelType w:val="hybridMultilevel"/>
     <w:tmpl w:val="3E9C37F8"/>
@@ -3198,7 +2852,7 @@
       </w:pPr>
     </w:lvl>
   </w:abstractNum>
-  <w:abstractNum w:abstractNumId="30" w15:restartNumberingAfterBreak="0">
+  <w:abstractNum w:abstractNumId="31" w15:restartNumberingAfterBreak="0">
     <w:nsid w:val="7E7777FF"/>
     <w:multiLevelType w:val="hybridMultilevel"/>
     <w:tmpl w:val="3E9C37F8"/>
@@ -3288,97 +2942,100 @@
     </w:lvl>
   </w:abstractNum>
   <w:num w:numId="1">
-    <w:abstractNumId w:val="10"/>
+    <w:abstractNumId w:val="11"/>
   </w:num>
   <w:num w:numId="2">
-    <w:abstractNumId w:val="17"/>
+    <w:abstractNumId w:val="18"/>
   </w:num>
   <w:num w:numId="3">
-    <w:abstractNumId w:val="18"/>
+    <w:abstractNumId w:val="19"/>
   </w:num>
   <w:num w:numId="4">
-    <w:abstractNumId w:val="20"/>
+    <w:abstractNumId w:val="21"/>
   </w:num>
   <w:num w:numId="5">
-    <w:abstractNumId w:val="30"/>
+    <w:abstractNumId w:val="31"/>
   </w:num>
   <w:num w:numId="6">
-    <w:abstractNumId w:val="11"/>
+    <w:abstractNumId w:val="12"/>
   </w:num>
   <w:num w:numId="7">
-    <w:abstractNumId w:val="27"/>
+    <w:abstractNumId w:val="28"/>
   </w:num>
   <w:num w:numId="8">
     <w:abstractNumId w:val="1"/>
   </w:num>
   <w:num w:numId="9">
+    <w:abstractNumId w:val="30"/>
+  </w:num>
+  <w:num w:numId="10">
+    <w:abstractNumId w:val="16"/>
+  </w:num>
+  <w:num w:numId="11">
+    <w:abstractNumId w:val="17"/>
+  </w:num>
+  <w:num w:numId="12">
+    <w:abstractNumId w:val="20"/>
+  </w:num>
+  <w:num w:numId="13">
+    <w:abstractNumId w:val="25"/>
+  </w:num>
+  <w:num w:numId="14">
     <w:abstractNumId w:val="29"/>
   </w:num>
-  <w:num w:numId="10">
+  <w:num w:numId="15">
     <w:abstractNumId w:val="15"/>
   </w:num>
-  <w:num w:numId="11">
-    <w:abstractNumId w:val="16"/>
+  <w:num w:numId="16">
+    <w:abstractNumId w:val="3"/>
   </w:num>
-  <w:num w:numId="12">
-    <w:abstractNumId w:val="19"/>
+  <w:num w:numId="17">
+    <w:abstractNumId w:val="26"/>
   </w:num>
-  <w:num w:numId="13">
+  <w:num w:numId="18">
+    <w:abstractNumId w:val="9"/>
+  </w:num>
+  <w:num w:numId="19">
+    <w:abstractNumId w:val="22"/>
+  </w:num>
+  <w:num w:numId="20">
+    <w:abstractNumId w:val="4"/>
+  </w:num>
+  <w:num w:numId="21">
     <w:abstractNumId w:val="24"/>
   </w:num>
-  <w:num w:numId="14">
-    <w:abstractNumId w:val="28"/>
+  <w:num w:numId="22">
+    <w:abstractNumId w:val="23"/>
   </w:num>
-  <w:num w:numId="15">
+  <w:num w:numId="23">
+    <w:abstractNumId w:val="27"/>
+  </w:num>
+  <w:num w:numId="24">
+    <w:abstractNumId w:val="7"/>
+  </w:num>
+  <w:num w:numId="25">
     <w:abstractNumId w:val="14"/>
   </w:num>
-  <w:num w:numId="16">
-    <w:abstractNumId w:val="2"/>
+  <w:num w:numId="26">
+    <w:abstractNumId w:val="10"/>
   </w:num>
-  <w:num w:numId="17">
-    <w:abstractNumId w:val="25"/>
+  <w:num w:numId="27">
+    <w:abstractNumId w:val="5"/>
   </w:num>
-  <w:num w:numId="18">
+  <w:num w:numId="28">
+    <w:abstractNumId w:val="13"/>
+  </w:num>
+  <w:num w:numId="29">
     <w:abstractNumId w:val="8"/>
   </w:num>
-  <w:num w:numId="19">
-    <w:abstractNumId w:val="21"/>
-  </w:num>
-  <w:num w:numId="20">
-    <w:abstractNumId w:val="3"/>
-  </w:num>
-  <w:num w:numId="21">
-    <w:abstractNumId w:val="23"/>
-  </w:num>
-  <w:num w:numId="22">
-    <w:abstractNumId w:val="22"/>
-  </w:num>
-  <w:num w:numId="23">
-    <w:abstractNumId w:val="26"/>
-  </w:num>
-  <w:num w:numId="24">
+  <w:num w:numId="30">
     <w:abstractNumId w:val="6"/>
-  </w:num>
-  <w:num w:numId="25">
-    <w:abstractNumId w:val="13"/>
-  </w:num>
-  <w:num w:numId="26">
-    <w:abstractNumId w:val="9"/>
-  </w:num>
-  <w:num w:numId="27">
-    <w:abstractNumId w:val="4"/>
-  </w:num>
-  <w:num w:numId="28">
-    <w:abstractNumId w:val="12"/>
-  </w:num>
-  <w:num w:numId="29">
-    <w:abstractNumId w:val="7"/>
-  </w:num>
-  <w:num w:numId="30">
-    <w:abstractNumId w:val="5"/>
   </w:num>
   <w:num w:numId="31">
     <w:abstractNumId w:val="0"/>
+  </w:num>
+  <w:num w:numId="32">
+    <w:abstractNumId w:val="2"/>
   </w:num>
   <w:numIdMacAtCleanup w:val="3"/>
 </w:numbering>
@@ -5600,8 +5257,8 @@
     <w:name w:val="stat12"/>
     <w:rsid w:val="00303AEF"/>
   </w:style>
-  <w:style w:type="character" w:styleId="aff">
-    <w:name w:val="Unresolved Mention"/>
+  <w:style w:type="character" w:customStyle="1" w:styleId="1b">
+    <w:name w:val="Неразрешенное упоминание1"/>
     <w:basedOn w:val="a0"/>
     <w:uiPriority w:val="99"/>
     <w:semiHidden/>
@@ -5901,11 +5558,11 @@
 </file>
 
 <file path=customXml/item1.xml><?xml version="1.0" encoding="utf-8"?>
-<b:Sources xmlns:b="http://schemas.openxmlformats.org/officeDocument/2006/bibliography" xmlns="http://schemas.openxmlformats.org/officeDocument/2006/bibliography" SelectedStyle="\APA.XSL" StyleName="APA Fifth Edition"/>
+<b:Sources xmlns:b="http://schemas.openxmlformats.org/officeDocument/2006/bibliography" xmlns="http://schemas.openxmlformats.org/officeDocument/2006/bibliography" SelectedStyle="\APA.XSL" StyleName="APA"/>
 </file>
 
 <file path=customXml/itemProps1.xml><?xml version="1.0" encoding="utf-8"?>
-<ds:datastoreItem xmlns:ds="http://schemas.openxmlformats.org/officeDocument/2006/customXml" ds:itemID="{C4E81A1A-0384-4AB2-B2C7-7287B33D661C}">
+<ds:datastoreItem xmlns:ds="http://schemas.openxmlformats.org/officeDocument/2006/customXml" ds:itemID="{4FDC9042-074C-49F6-838A-BACBC9CB808A}">
   <ds:schemaRefs>
     <ds:schemaRef ds:uri="http://schemas.openxmlformats.org/officeDocument/2006/bibliography"/>
   </ds:schemaRefs>

</xml_diff>

<commit_message>
Fix bolvanki titles, margins, and merged page numbering.
Restore company templates with engineer page margins and corrected
ОЗОТОБОС/Стройфинансгрупп titles; fix merge sectPr placement and static
page counts instead of broken Word PAGE fields.

Co-authored-by: Cursor <cursoragent@cursor.com>
</commit_message>
<xml_diff>
--- a/data/templates/Геодезический контроль.docx
+++ b/data/templates/Геодезический контроль.docx
@@ -3,15 +3,44 @@
 <w:document xmlns:wpc="http://schemas.microsoft.com/office/word/2010/wordprocessingCanvas" xmlns:cx="http://schemas.microsoft.com/office/drawing/2014/chartex" xmlns:cx1="http://schemas.microsoft.com/office/drawing/2015/9/8/chartex" xmlns:cx2="http://schemas.microsoft.com/office/drawing/2015/10/21/chartex" xmlns:cx3="http://schemas.microsoft.com/office/drawing/2016/5/9/chartex" xmlns:cx4="http://schemas.microsoft.com/office/drawing/2016/5/10/chartex" xmlns:cx5="http://schemas.microsoft.com/office/drawing/2016/5/11/chartex" xmlns:cx6="http://schemas.microsoft.com/office/drawing/2016/5/12/chartex" xmlns:cx7="http://schemas.microsoft.com/office/drawing/2016/5/13/chartex" xmlns:cx8="http://schemas.microsoft.com/office/drawing/2016/5/14/chartex" xmlns:mc="http://schemas.openxmlformats.org/markup-compatibility/2006" xmlns:aink="http://schemas.microsoft.com/office/drawing/2016/ink" xmlns:am3d="http://schemas.microsoft.com/office/drawing/2017/model3d" xmlns:o="urn:schemas-microsoft-com:office:office" xmlns:r="http://schemas.openxmlformats.org/officeDocument/2006/relationships" xmlns:m="http://schemas.openxmlformats.org/officeDocument/2006/math" xmlns:v="urn:schemas-microsoft-com:vml" xmlns:wp14="http://schemas.microsoft.com/office/word/2010/wordprocessingDrawing" xmlns:wp="http://schemas.openxmlformats.org/drawingml/2006/wordprocessingDrawing" xmlns:w10="urn:schemas-microsoft-com:office:word" xmlns:w="http://schemas.openxmlformats.org/wordprocessingml/2006/main" xmlns:w14="http://schemas.microsoft.com/office/word/2010/wordml" xmlns:w15="http://schemas.microsoft.com/office/word/2012/wordml" xmlns:w16cex="http://schemas.microsoft.com/office/word/2018/wordml/cex" xmlns:w16cid="http://schemas.microsoft.com/office/word/2016/wordml/cid" xmlns:w16="http://schemas.microsoft.com/office/word/2018/wordml" xmlns:w16se="http://schemas.microsoft.com/office/word/2015/wordml/symex" xmlns:wpg="http://schemas.microsoft.com/office/word/2010/wordprocessingGroup" xmlns:wpi="http://schemas.microsoft.com/office/word/2010/wordprocessingInk" xmlns:wne="http://schemas.microsoft.com/office/word/2006/wordml" xmlns:wps="http://schemas.microsoft.com/office/word/2010/wordprocessingShape" mc:Ignorable="w14 w15 w16se w16cid w16 w16cex wp14">
   <w:body>
     <w:p>
+      <w:pPr>
+        <w:spacing w:after="0" w:line="240" w:lineRule="auto"/>
+        <w:jc w:val="center"/>
+        <w:rPr>
+          <w:rFonts w:ascii="Times New Roman" w:hAnsi="Times New Roman" w:cs="Times New Roman"/>
+          <w:b/>
+          <w:sz w:val="20"/>
+          <w:szCs w:val="20"/>
+        </w:rPr>
+      </w:pPr>
       <w:r>
+        <w:rPr>
+          <w:rFonts w:ascii="Times New Roman" w:hAnsi="Times New Roman" w:cs="Times New Roman"/>
+          <w:b/>
+          <w:sz w:val="20"/>
+          <w:szCs w:val="20"/>
+        </w:rPr>
         <w:t xml:space="preserve">Отчёт строительного контроля по Геодезическому контролю за </w:t>
       </w:r>
+      <w:bookmarkStart w:id="0" w:name="_GoBack"/>
+      <w:bookmarkEnd w:id="0"/>
     </w:p>
-    <w:p/>
+    <w:p>
+      <w:pPr>
+        <w:spacing w:after="0" w:line="240" w:lineRule="auto"/>
+        <w:jc w:val="center"/>
+        <w:rPr>
+          <w:rFonts w:ascii="Times New Roman" w:hAnsi="Times New Roman" w:cs="Times New Roman"/>
+          <w:bCs/>
+          <w:sz w:val="20"/>
+          <w:szCs w:val="20"/>
+        </w:rPr>
+      </w:pPr>
+    </w:p>
     <w:sectPr>
+      <w:pgMar w:top="284" w:right="567" w:bottom="567" w:left="1134" w:header="284" w:footer="709" w:gutter="0"/>
       <w:headerReference w:type="default" r:id="rId8"/>
       <w:pgSz w:w="11906" w:h="16838"/>
-      <w:pgMar w:top="284" w:right="567" w:bottom="567" w:left="1134" w:header="284" w:footer="709" w:gutter="0"/>
       <w:cols w:space="708"/>
       <w:docGrid w:linePitch="360"/>
     </w:sectPr>
@@ -71,6 +100,413 @@
 
 <file path=word/header1.xml><?xml version="1.0" encoding="utf-8"?>
 <w:hdr xmlns:wpc="http://schemas.microsoft.com/office/word/2010/wordprocessingCanvas" xmlns:cx="http://schemas.microsoft.com/office/drawing/2014/chartex" xmlns:cx1="http://schemas.microsoft.com/office/drawing/2015/9/8/chartex" xmlns:cx2="http://schemas.microsoft.com/office/drawing/2015/10/21/chartex" xmlns:cx3="http://schemas.microsoft.com/office/drawing/2016/5/9/chartex" xmlns:cx4="http://schemas.microsoft.com/office/drawing/2016/5/10/chartex" xmlns:cx5="http://schemas.microsoft.com/office/drawing/2016/5/11/chartex" xmlns:cx6="http://schemas.microsoft.com/office/drawing/2016/5/12/chartex" xmlns:cx7="http://schemas.microsoft.com/office/drawing/2016/5/13/chartex" xmlns:cx8="http://schemas.microsoft.com/office/drawing/2016/5/14/chartex" xmlns:mc="http://schemas.openxmlformats.org/markup-compatibility/2006" xmlns:aink="http://schemas.microsoft.com/office/drawing/2016/ink" xmlns:am3d="http://schemas.microsoft.com/office/drawing/2017/model3d" xmlns:o="urn:schemas-microsoft-com:office:office" xmlns:r="http://schemas.openxmlformats.org/officeDocument/2006/relationships" xmlns:m="http://schemas.openxmlformats.org/officeDocument/2006/math" xmlns:v="urn:schemas-microsoft-com:vml" xmlns:wp14="http://schemas.microsoft.com/office/word/2010/wordprocessingDrawing" xmlns:wp="http://schemas.openxmlformats.org/drawingml/2006/wordprocessingDrawing" xmlns:w10="urn:schemas-microsoft-com:office:word" xmlns:w="http://schemas.openxmlformats.org/wordprocessingml/2006/main" xmlns:w14="http://schemas.microsoft.com/office/word/2010/wordml" xmlns:w15="http://schemas.microsoft.com/office/word/2012/wordml" xmlns:w16cex="http://schemas.microsoft.com/office/word/2018/wordml/cex" xmlns:w16cid="http://schemas.microsoft.com/office/word/2016/wordml/cid" xmlns:w16="http://schemas.microsoft.com/office/word/2018/wordml" xmlns:w16se="http://schemas.microsoft.com/office/word/2015/wordml/symex" xmlns:wpg="http://schemas.microsoft.com/office/word/2010/wordprocessingGroup" xmlns:wpi="http://schemas.microsoft.com/office/word/2010/wordprocessingInk" xmlns:wne="http://schemas.microsoft.com/office/word/2006/wordml" xmlns:wps="http://schemas.microsoft.com/office/word/2010/wordprocessingShape" mc:Ignorable="w14 w15 w16se w16cid w16 w16cex wp14">
+  <w:tbl>
+    <w:tblPr>
+      <w:tblStyle w:val="ab"/>
+      <w:tblW w:w="10586" w:type="dxa"/>
+      <w:tblInd w:w="-284" w:type="dxa"/>
+      <w:tblBorders>
+        <w:top w:val="none" w:sz="0" w:space="0" w:color="auto"/>
+        <w:left w:val="none" w:sz="0" w:space="0" w:color="auto"/>
+        <w:bottom w:val="none" w:sz="0" w:space="0" w:color="auto"/>
+        <w:right w:val="none" w:sz="0" w:space="0" w:color="auto"/>
+        <w:insideH w:val="none" w:sz="0" w:space="0" w:color="auto"/>
+        <w:insideV w:val="none" w:sz="0" w:space="0" w:color="auto"/>
+      </w:tblBorders>
+      <w:tblCellMar>
+        <w:left w:w="0" w:type="dxa"/>
+        <w:right w:w="0" w:type="dxa"/>
+      </w:tblCellMar>
+      <w:tblLook w:val="04A0" w:firstRow="1" w:lastRow="0" w:firstColumn="1" w:lastColumn="0" w:noHBand="0" w:noVBand="1"/>
+    </w:tblPr>
+    <w:tblGrid>
+      <w:gridCol w:w="1747"/>
+      <w:gridCol w:w="1893"/>
+      <w:gridCol w:w="1205"/>
+      <w:gridCol w:w="1068"/>
+      <w:gridCol w:w="1558"/>
+      <w:gridCol w:w="3211"/>
+    </w:tblGrid>
+    <w:tr>
+      <w:trPr>
+        <w:trHeight w:val="300"/>
+      </w:trPr>
+      <w:tc>
+        <w:tcPr>
+          <w:tcW w:w="1731" w:type="dxa"/>
+          <w:noWrap/>
+          <w:hideMark/>
+        </w:tcPr>
+        <w:p>
+          <w:pPr>
+            <w:rPr>
+              <w:rFonts w:ascii="Times New Roman" w:hAnsi="Times New Roman"/>
+              <w:sz w:val="20"/>
+              <w:szCs w:val="20"/>
+            </w:rPr>
+          </w:pPr>
+          <w:r>
+            <w:rPr>
+              <w:rFonts w:ascii="Times New Roman" w:hAnsi="Times New Roman"/>
+              <w:sz w:val="20"/>
+              <w:szCs w:val="20"/>
+            </w:rPr>
+            <w:t>Заказчик:</w:t>
+          </w:r>
+        </w:p>
+      </w:tc>
+      <w:tc>
+        <w:tcPr>
+          <w:tcW w:w="1877" w:type="dxa"/>
+          <w:noWrap/>
+          <w:hideMark/>
+        </w:tcPr>
+        <w:p>
+          <w:pPr>
+            <w:rPr>
+              <w:rFonts w:ascii="Times New Roman" w:hAnsi="Times New Roman"/>
+              <w:sz w:val="20"/>
+              <w:szCs w:val="20"/>
+            </w:rPr>
+          </w:pPr>
+          <w:r>
+            <w:rPr>
+              <w:rFonts w:ascii="Times New Roman" w:hAnsi="Times New Roman"/>
+              <w:sz w:val="20"/>
+              <w:szCs w:val="20"/>
+            </w:rPr>
+            <w:t>ООО "СПД"</w:t>
+          </w:r>
+        </w:p>
+      </w:tc>
+      <w:tc>
+        <w:tcPr>
+          <w:tcW w:w="1189" w:type="dxa"/>
+          <w:noWrap/>
+          <w:hideMark/>
+        </w:tcPr>
+        <w:p>
+          <w:pPr>
+            <w:jc w:val="center"/>
+            <w:rPr>
+              <w:rFonts w:ascii="Times New Roman" w:hAnsi="Times New Roman"/>
+              <w:sz w:val="20"/>
+              <w:szCs w:val="20"/>
+            </w:rPr>
+          </w:pPr>
+          <w:r>
+            <w:rPr>
+              <w:rFonts w:ascii="Times New Roman" w:hAnsi="Times New Roman"/>
+              <w:sz w:val="20"/>
+              <w:szCs w:val="20"/>
+            </w:rPr>
+            <w:t> </w:t>
+          </w:r>
+        </w:p>
+      </w:tc>
+      <w:tc>
+        <w:tcPr>
+          <w:tcW w:w="1052" w:type="dxa"/>
+          <w:noWrap/>
+          <w:hideMark/>
+        </w:tcPr>
+        <w:p>
+          <w:pPr>
+            <w:jc w:val="center"/>
+            <w:rPr>
+              <w:rFonts w:ascii="Times New Roman" w:hAnsi="Times New Roman"/>
+              <w:sz w:val="20"/>
+              <w:szCs w:val="20"/>
+            </w:rPr>
+          </w:pPr>
+          <w:r>
+            <w:rPr>
+              <w:rFonts w:ascii="Times New Roman" w:hAnsi="Times New Roman"/>
+              <w:sz w:val="20"/>
+              <w:szCs w:val="20"/>
+            </w:rPr>
+            <w:t> </w:t>
+          </w:r>
+        </w:p>
+      </w:tc>
+      <w:tc>
+        <w:tcPr>
+          <w:tcW w:w="1542" w:type="dxa"/>
+          <w:noWrap/>
+          <w:hideMark/>
+        </w:tcPr>
+        <w:p>
+          <w:pPr>
+            <w:jc w:val="center"/>
+            <w:rPr>
+              <w:rFonts w:ascii="Times New Roman" w:hAnsi="Times New Roman"/>
+              <w:sz w:val="20"/>
+              <w:szCs w:val="20"/>
+            </w:rPr>
+          </w:pPr>
+          <w:r>
+            <w:rPr>
+              <w:rFonts w:ascii="Times New Roman" w:hAnsi="Times New Roman"/>
+              <w:sz w:val="20"/>
+              <w:szCs w:val="20"/>
+            </w:rPr>
+            <w:t> </w:t>
+          </w:r>
+        </w:p>
+      </w:tc>
+      <w:tc>
+        <w:tcPr>
+          <w:tcW w:w="3195" w:type="dxa"/>
+          <w:noWrap/>
+          <w:hideMark/>
+        </w:tcPr>
+        <w:p>
+          <w:pPr>
+            <w:jc w:val="right"/>
+            <w:rPr>
+              <w:rFonts w:ascii="Times New Roman" w:hAnsi="Times New Roman"/>
+              <w:sz w:val="20"/>
+              <w:szCs w:val="20"/>
+            </w:rPr>
+          </w:pPr>
+          <w:r>
+            <w:rPr>
+              <w:rFonts w:ascii="Times New Roman" w:hAnsi="Times New Roman"/>
+              <w:sz w:val="20"/>
+              <w:szCs w:val="20"/>
+            </w:rPr>
+            <w:t>Приложение № 16</w:t>
+          </w:r>
+        </w:p>
+      </w:tc>
+    </w:tr>
+    <w:tr>
+      <w:trPr>
+        <w:trHeight w:val="300"/>
+      </w:trPr>
+      <w:tc>
+        <w:tcPr>
+          <w:tcW w:w="1731" w:type="dxa"/>
+          <w:noWrap/>
+          <w:hideMark/>
+        </w:tcPr>
+        <w:p>
+          <w:pPr>
+            <w:rPr>
+              <w:rFonts w:ascii="Times New Roman" w:hAnsi="Times New Roman"/>
+              <w:sz w:val="20"/>
+              <w:szCs w:val="20"/>
+            </w:rPr>
+          </w:pPr>
+          <w:r>
+            <w:rPr>
+              <w:rFonts w:ascii="Times New Roman" w:hAnsi="Times New Roman"/>
+              <w:sz w:val="20"/>
+              <w:szCs w:val="20"/>
+            </w:rPr>
+            <w:t xml:space="preserve">Исполнитель: </w:t>
+          </w:r>
+        </w:p>
+      </w:tc>
+      <w:tc>
+        <w:tcPr>
+          <w:tcW w:w="1877" w:type="dxa"/>
+          <w:noWrap/>
+          <w:hideMark/>
+        </w:tcPr>
+        <w:p>
+          <w:pPr>
+            <w:rPr>
+              <w:rFonts w:ascii="Times New Roman" w:hAnsi="Times New Roman"/>
+              <w:sz w:val="20"/>
+              <w:szCs w:val="20"/>
+            </w:rPr>
+          </w:pPr>
+          <w:r>
+            <w:rPr>
+              <w:rFonts w:ascii="Times New Roman" w:hAnsi="Times New Roman"/>
+              <w:sz w:val="20"/>
+              <w:szCs w:val="20"/>
+            </w:rPr>
+            <w:t>ООО "Техресурс"</w:t>
+          </w:r>
+        </w:p>
+      </w:tc>
+      <w:tc>
+        <w:tcPr>
+          <w:tcW w:w="1189" w:type="dxa"/>
+          <w:noWrap/>
+          <w:hideMark/>
+        </w:tcPr>
+        <w:p>
+          <w:pPr>
+            <w:jc w:val="center"/>
+            <w:rPr>
+              <w:rFonts w:ascii="Times New Roman" w:hAnsi="Times New Roman"/>
+              <w:sz w:val="20"/>
+              <w:szCs w:val="20"/>
+            </w:rPr>
+          </w:pPr>
+          <w:r>
+            <w:rPr>
+              <w:rFonts w:ascii="Times New Roman" w:hAnsi="Times New Roman"/>
+              <w:sz w:val="20"/>
+              <w:szCs w:val="20"/>
+            </w:rPr>
+            <w:t> </w:t>
+          </w:r>
+        </w:p>
+      </w:tc>
+      <w:tc>
+        <w:tcPr>
+          <w:tcW w:w="1052" w:type="dxa"/>
+          <w:noWrap/>
+          <w:hideMark/>
+        </w:tcPr>
+        <w:p>
+          <w:pPr>
+            <w:jc w:val="center"/>
+            <w:rPr>
+              <w:rFonts w:ascii="Times New Roman" w:hAnsi="Times New Roman"/>
+              <w:sz w:val="20"/>
+              <w:szCs w:val="20"/>
+            </w:rPr>
+          </w:pPr>
+          <w:r>
+            <w:rPr>
+              <w:noProof/>
+            </w:rPr>
+            <w:drawing>
+              <wp:anchor distT="0" distB="0" distL="114300" distR="114300" simplePos="0" relativeHeight="251658752" behindDoc="0" locked="0" layoutInCell="1" allowOverlap="1" wp14:anchorId="52C3F301" wp14:editId="524FABBD">
+                <wp:simplePos x="0" y="0"/>
+                <wp:positionH relativeFrom="column">
+                  <wp:posOffset>-602814</wp:posOffset>
+                </wp:positionH>
+                <wp:positionV relativeFrom="paragraph">
+                  <wp:posOffset>-140417</wp:posOffset>
+                </wp:positionV>
+                <wp:extent cx="1929064" cy="876300"/>
+                <wp:effectExtent l="0" t="0" r="0" b="0"/>
+                <wp:wrapNone/>
+                <wp:docPr id="1351832037" name="Рисунок 9">
+                  <a:extLst xmlns:a="http://schemas.openxmlformats.org/drawingml/2006/main">
+                    <a:ext uri="{FF2B5EF4-FFF2-40B4-BE49-F238E27FC236}">
+                      <a16:creationId xmlns:a16="http://schemas.microsoft.com/office/drawing/2014/main" id="{95163124-6A06-F45E-ADD6-63EEFA42AA28}"/>
+                    </a:ext>
+                  </a:extLst>
+                </wp:docPr>
+                <wp:cNvGraphicFramePr>
+                  <a:graphicFrameLocks xmlns:a="http://schemas.openxmlformats.org/drawingml/2006/main" noChangeAspect="1"/>
+                </wp:cNvGraphicFramePr>
+                <a:graphic xmlns:a="http://schemas.openxmlformats.org/drawingml/2006/main">
+                  <a:graphicData uri="http://schemas.openxmlformats.org/drawingml/2006/picture">
+                    <pic:pic xmlns:pic="http://schemas.openxmlformats.org/drawingml/2006/picture">
+                      <pic:nvPicPr>
+                        <pic:cNvPr id="10" name="Рисунок 9">
+                          <a:extLst>
+                            <a:ext uri="{FF2B5EF4-FFF2-40B4-BE49-F238E27FC236}">
+                              <a16:creationId xmlns:a16="http://schemas.microsoft.com/office/drawing/2014/main" id="{95163124-6A06-F45E-ADD6-63EEFA42AA28}"/>
+                            </a:ext>
+                          </a:extLst>
+                        </pic:cNvPr>
+                        <pic:cNvPicPr>
+                          <a:picLocks noChangeAspect="1"/>
+                        </pic:cNvPicPr>
+                      </pic:nvPicPr>
+                      <pic:blipFill>
+                        <a:blip r:embed="rId1" cstate="email">
+                          <a:extLst>
+                            <a:ext uri="{28A0092B-C50C-407E-A947-70E740481C1C}">
+                              <a14:useLocalDpi xmlns:a14="http://schemas.microsoft.com/office/drawing/2010/main" val="0"/>
+                            </a:ext>
+                          </a:extLst>
+                        </a:blip>
+                        <a:srcRect/>
+                        <a:stretch>
+                          <a:fillRect/>
+                        </a:stretch>
+                      </pic:blipFill>
+                      <pic:spPr bwMode="auto">
+                        <a:xfrm>
+                          <a:off x="0" y="0"/>
+                          <a:ext cx="1929064" cy="876300"/>
+                        </a:xfrm>
+                        <a:prstGeom prst="rect">
+                          <a:avLst/>
+                        </a:prstGeom>
+                        <a:noFill/>
+                        <a:ln>
+                          <a:noFill/>
+                        </a:ln>
+                      </pic:spPr>
+                    </pic:pic>
+                  </a:graphicData>
+                </a:graphic>
+              </wp:anchor>
+            </w:drawing>
+          </w:r>
+          <w:r>
+            <w:rPr>
+              <w:rFonts w:ascii="Times New Roman" w:hAnsi="Times New Roman"/>
+              <w:sz w:val="20"/>
+              <w:szCs w:val="20"/>
+            </w:rPr>
+            <w:t> </w:t>
+          </w:r>
+        </w:p>
+      </w:tc>
+      <w:tc>
+        <w:tcPr>
+          <w:tcW w:w="1542" w:type="dxa"/>
+          <w:noWrap/>
+          <w:hideMark/>
+        </w:tcPr>
+        <w:p>
+          <w:pPr>
+            <w:jc w:val="center"/>
+            <w:rPr>
+              <w:rFonts w:ascii="Times New Roman" w:hAnsi="Times New Roman"/>
+              <w:sz w:val="20"/>
+              <w:szCs w:val="20"/>
+            </w:rPr>
+          </w:pPr>
+          <w:r>
+            <w:rPr>
+              <w:rFonts w:ascii="Times New Roman" w:hAnsi="Times New Roman"/>
+              <w:sz w:val="20"/>
+              <w:szCs w:val="20"/>
+            </w:rPr>
+            <w:t> </w:t>
+          </w:r>
+        </w:p>
+      </w:tc>
+      <w:tc>
+        <w:tcPr>
+          <w:tcW w:w="3195" w:type="dxa"/>
+          <w:noWrap/>
+          <w:hideMark/>
+        </w:tcPr>
+        <w:p>
+          <w:pPr>
+            <w:jc w:val="right"/>
+            <w:rPr>
+              <w:rFonts w:ascii="Times New Roman" w:hAnsi="Times New Roman"/>
+              <w:sz w:val="20"/>
+              <w:szCs w:val="20"/>
+            </w:rPr>
+          </w:pPr>
+          <w:r>
+            <w:rPr>
+              <w:rFonts w:ascii="Times New Roman" w:hAnsi="Times New Roman"/>
+              <w:sz w:val="20"/>
+              <w:szCs w:val="20"/>
+            </w:rPr>
+            <w:t>к Договору № MOS/25/0008</w:t>
+          </w:r>
+        </w:p>
+      </w:tc>
+    </w:tr>
+  </w:tbl>
   <w:p>
     <w:pPr>
       <w:spacing w:after="0"/>
@@ -266,96 +702,6 @@
     </w:lvl>
   </w:abstractNum>
   <w:abstractNum w:abstractNumId="2" w15:restartNumberingAfterBreak="0">
-    <w:nsid w:val="0D7A28D5"/>
-    <w:multiLevelType w:val="hybridMultilevel"/>
-    <w:tmpl w:val="95D21128"/>
-    <w:lvl w:ilvl="0" w:tplc="56DCA94E">
-      <w:start w:val="1"/>
-      <w:numFmt w:val="decimal"/>
-      <w:lvlText w:val="%1."/>
-      <w:lvlJc w:val="left"/>
-      <w:pPr>
-        <w:ind w:left="720" w:hanging="360"/>
-      </w:pPr>
-      <w:rPr>
-        <w:rFonts w:hint="default"/>
-        <w:b/>
-      </w:rPr>
-    </w:lvl>
-    <w:lvl w:ilvl="1" w:tplc="04190019" w:tentative="1">
-      <w:start w:val="1"/>
-      <w:numFmt w:val="lowerLetter"/>
-      <w:lvlText w:val="%2."/>
-      <w:lvlJc w:val="left"/>
-      <w:pPr>
-        <w:ind w:left="1440" w:hanging="360"/>
-      </w:pPr>
-    </w:lvl>
-    <w:lvl w:ilvl="2" w:tplc="0419001B" w:tentative="1">
-      <w:start w:val="1"/>
-      <w:numFmt w:val="lowerRoman"/>
-      <w:lvlText w:val="%3."/>
-      <w:lvlJc w:val="right"/>
-      <w:pPr>
-        <w:ind w:left="2160" w:hanging="180"/>
-      </w:pPr>
-    </w:lvl>
-    <w:lvl w:ilvl="3" w:tplc="0419000F" w:tentative="1">
-      <w:start w:val="1"/>
-      <w:numFmt w:val="decimal"/>
-      <w:lvlText w:val="%4."/>
-      <w:lvlJc w:val="left"/>
-      <w:pPr>
-        <w:ind w:left="2880" w:hanging="360"/>
-      </w:pPr>
-    </w:lvl>
-    <w:lvl w:ilvl="4" w:tplc="04190019" w:tentative="1">
-      <w:start w:val="1"/>
-      <w:numFmt w:val="lowerLetter"/>
-      <w:lvlText w:val="%5."/>
-      <w:lvlJc w:val="left"/>
-      <w:pPr>
-        <w:ind w:left="3600" w:hanging="360"/>
-      </w:pPr>
-    </w:lvl>
-    <w:lvl w:ilvl="5" w:tplc="0419001B" w:tentative="1">
-      <w:start w:val="1"/>
-      <w:numFmt w:val="lowerRoman"/>
-      <w:lvlText w:val="%6."/>
-      <w:lvlJc w:val="right"/>
-      <w:pPr>
-        <w:ind w:left="4320" w:hanging="180"/>
-      </w:pPr>
-    </w:lvl>
-    <w:lvl w:ilvl="6" w:tplc="0419000F" w:tentative="1">
-      <w:start w:val="1"/>
-      <w:numFmt w:val="decimal"/>
-      <w:lvlText w:val="%7."/>
-      <w:lvlJc w:val="left"/>
-      <w:pPr>
-        <w:ind w:left="5040" w:hanging="360"/>
-      </w:pPr>
-    </w:lvl>
-    <w:lvl w:ilvl="7" w:tplc="04190019" w:tentative="1">
-      <w:start w:val="1"/>
-      <w:numFmt w:val="lowerLetter"/>
-      <w:lvlText w:val="%8."/>
-      <w:lvlJc w:val="left"/>
-      <w:pPr>
-        <w:ind w:left="5760" w:hanging="360"/>
-      </w:pPr>
-    </w:lvl>
-    <w:lvl w:ilvl="8" w:tplc="0419001B" w:tentative="1">
-      <w:start w:val="1"/>
-      <w:numFmt w:val="lowerRoman"/>
-      <w:lvlText w:val="%9."/>
-      <w:lvlJc w:val="right"/>
-      <w:pPr>
-        <w:ind w:left="6480" w:hanging="180"/>
-      </w:pPr>
-    </w:lvl>
-  </w:abstractNum>
-  <w:abstractNum w:abstractNumId="3" w15:restartNumberingAfterBreak="0">
     <w:nsid w:val="0FAC65EF"/>
     <w:multiLevelType w:val="hybridMultilevel"/>
     <w:tmpl w:val="785CF232"/>
@@ -444,7 +790,7 @@
       </w:pPr>
     </w:lvl>
   </w:abstractNum>
-  <w:abstractNum w:abstractNumId="4" w15:restartNumberingAfterBreak="0">
+  <w:abstractNum w:abstractNumId="3" w15:restartNumberingAfterBreak="0">
     <w:nsid w:val="15825FF9"/>
     <w:multiLevelType w:val="hybridMultilevel"/>
     <w:tmpl w:val="25FEE7FC"/>
@@ -533,7 +879,7 @@
       </w:pPr>
     </w:lvl>
   </w:abstractNum>
-  <w:abstractNum w:abstractNumId="5" w15:restartNumberingAfterBreak="0">
+  <w:abstractNum w:abstractNumId="4" w15:restartNumberingAfterBreak="0">
     <w:nsid w:val="1BFB2D00"/>
     <w:multiLevelType w:val="hybridMultilevel"/>
     <w:tmpl w:val="0CB602D4"/>
@@ -624,7 +970,7 @@
       </w:pPr>
     </w:lvl>
   </w:abstractNum>
-  <w:abstractNum w:abstractNumId="6" w15:restartNumberingAfterBreak="0">
+  <w:abstractNum w:abstractNumId="5" w15:restartNumberingAfterBreak="0">
     <w:nsid w:val="252116D5"/>
     <w:multiLevelType w:val="hybridMultilevel"/>
     <w:tmpl w:val="9C7E3A28"/>
@@ -713,7 +1059,7 @@
       </w:pPr>
     </w:lvl>
   </w:abstractNum>
-  <w:abstractNum w:abstractNumId="7" w15:restartNumberingAfterBreak="0">
+  <w:abstractNum w:abstractNumId="6" w15:restartNumberingAfterBreak="0">
     <w:nsid w:val="29985E31"/>
     <w:multiLevelType w:val="hybridMultilevel"/>
     <w:tmpl w:val="F18C3C9E"/>
@@ -802,7 +1148,7 @@
       </w:pPr>
     </w:lvl>
   </w:abstractNum>
-  <w:abstractNum w:abstractNumId="8" w15:restartNumberingAfterBreak="0">
+  <w:abstractNum w:abstractNumId="7" w15:restartNumberingAfterBreak="0">
     <w:nsid w:val="2BA22891"/>
     <w:multiLevelType w:val="hybridMultilevel"/>
     <w:tmpl w:val="DA44EF50"/>
@@ -891,7 +1237,7 @@
       </w:pPr>
     </w:lvl>
   </w:abstractNum>
-  <w:abstractNum w:abstractNumId="9" w15:restartNumberingAfterBreak="0">
+  <w:abstractNum w:abstractNumId="8" w15:restartNumberingAfterBreak="0">
     <w:nsid w:val="2DA83EAA"/>
     <w:multiLevelType w:val="hybridMultilevel"/>
     <w:tmpl w:val="785CF232"/>
@@ -980,7 +1326,7 @@
       </w:pPr>
     </w:lvl>
   </w:abstractNum>
-  <w:abstractNum w:abstractNumId="10" w15:restartNumberingAfterBreak="0">
+  <w:abstractNum w:abstractNumId="9" w15:restartNumberingAfterBreak="0">
     <w:nsid w:val="343A4F11"/>
     <w:multiLevelType w:val="hybridMultilevel"/>
     <w:tmpl w:val="67BC3878"/>
@@ -1069,7 +1415,7 @@
       </w:pPr>
     </w:lvl>
   </w:abstractNum>
-  <w:abstractNum w:abstractNumId="11" w15:restartNumberingAfterBreak="0">
+  <w:abstractNum w:abstractNumId="10" w15:restartNumberingAfterBreak="0">
     <w:nsid w:val="35605315"/>
     <w:multiLevelType w:val="hybridMultilevel"/>
     <w:tmpl w:val="785CF232"/>
@@ -1158,7 +1504,7 @@
       </w:pPr>
     </w:lvl>
   </w:abstractNum>
-  <w:abstractNum w:abstractNumId="12" w15:restartNumberingAfterBreak="0">
+  <w:abstractNum w:abstractNumId="11" w15:restartNumberingAfterBreak="0">
     <w:nsid w:val="3704479B"/>
     <w:multiLevelType w:val="hybridMultilevel"/>
     <w:tmpl w:val="3E9C37F8"/>
@@ -1247,7 +1593,7 @@
       </w:pPr>
     </w:lvl>
   </w:abstractNum>
-  <w:abstractNum w:abstractNumId="13" w15:restartNumberingAfterBreak="0">
+  <w:abstractNum w:abstractNumId="12" w15:restartNumberingAfterBreak="0">
     <w:nsid w:val="37305FAE"/>
     <w:multiLevelType w:val="hybridMultilevel"/>
     <w:tmpl w:val="0FF8DCE6"/>
@@ -1337,7 +1683,7 @@
       </w:pPr>
     </w:lvl>
   </w:abstractNum>
-  <w:abstractNum w:abstractNumId="14" w15:restartNumberingAfterBreak="0">
+  <w:abstractNum w:abstractNumId="13" w15:restartNumberingAfterBreak="0">
     <w:nsid w:val="38FF472C"/>
     <w:multiLevelType w:val="hybridMultilevel"/>
     <w:tmpl w:val="06F085A0"/>
@@ -1426,7 +1772,7 @@
       </w:pPr>
     </w:lvl>
   </w:abstractNum>
-  <w:abstractNum w:abstractNumId="15" w15:restartNumberingAfterBreak="0">
+  <w:abstractNum w:abstractNumId="14" w15:restartNumberingAfterBreak="0">
     <w:nsid w:val="39EA16F8"/>
     <w:multiLevelType w:val="hybridMultilevel"/>
     <w:tmpl w:val="E75AEF56"/>
@@ -1515,7 +1861,7 @@
       </w:pPr>
     </w:lvl>
   </w:abstractNum>
-  <w:abstractNum w:abstractNumId="16" w15:restartNumberingAfterBreak="0">
+  <w:abstractNum w:abstractNumId="15" w15:restartNumberingAfterBreak="0">
     <w:nsid w:val="3FF30ED6"/>
     <w:multiLevelType w:val="hybridMultilevel"/>
     <w:tmpl w:val="E95401DA"/>
@@ -1604,7 +1950,7 @@
       </w:pPr>
     </w:lvl>
   </w:abstractNum>
-  <w:abstractNum w:abstractNumId="17" w15:restartNumberingAfterBreak="0">
+  <w:abstractNum w:abstractNumId="16" w15:restartNumberingAfterBreak="0">
     <w:nsid w:val="4193788B"/>
     <w:multiLevelType w:val="hybridMultilevel"/>
     <w:tmpl w:val="E95401DA"/>
@@ -1693,7 +2039,7 @@
       </w:pPr>
     </w:lvl>
   </w:abstractNum>
-  <w:abstractNum w:abstractNumId="18" w15:restartNumberingAfterBreak="0">
+  <w:abstractNum w:abstractNumId="17" w15:restartNumberingAfterBreak="0">
     <w:nsid w:val="4F7B562C"/>
     <w:multiLevelType w:val="hybridMultilevel"/>
     <w:tmpl w:val="785CF232"/>
@@ -1782,7 +2128,7 @@
       </w:pPr>
     </w:lvl>
   </w:abstractNum>
-  <w:abstractNum w:abstractNumId="19" w15:restartNumberingAfterBreak="0">
+  <w:abstractNum w:abstractNumId="18" w15:restartNumberingAfterBreak="0">
     <w:nsid w:val="5286366B"/>
     <w:multiLevelType w:val="hybridMultilevel"/>
     <w:tmpl w:val="7FD2070C"/>
@@ -1871,7 +2217,7 @@
       </w:pPr>
     </w:lvl>
   </w:abstractNum>
-  <w:abstractNum w:abstractNumId="20" w15:restartNumberingAfterBreak="0">
+  <w:abstractNum w:abstractNumId="19" w15:restartNumberingAfterBreak="0">
     <w:nsid w:val="53C62639"/>
     <w:multiLevelType w:val="hybridMultilevel"/>
     <w:tmpl w:val="E95401DA"/>
@@ -1960,7 +2306,7 @@
       </w:pPr>
     </w:lvl>
   </w:abstractNum>
-  <w:abstractNum w:abstractNumId="21" w15:restartNumberingAfterBreak="0">
+  <w:abstractNum w:abstractNumId="20" w15:restartNumberingAfterBreak="0">
     <w:nsid w:val="5695598B"/>
     <w:multiLevelType w:val="hybridMultilevel"/>
     <w:tmpl w:val="688C552E"/>
@@ -2050,7 +2396,7 @@
       </w:pPr>
     </w:lvl>
   </w:abstractNum>
-  <w:abstractNum w:abstractNumId="22" w15:restartNumberingAfterBreak="0">
+  <w:abstractNum w:abstractNumId="21" w15:restartNumberingAfterBreak="0">
     <w:nsid w:val="57A33FE1"/>
     <w:multiLevelType w:val="hybridMultilevel"/>
     <w:tmpl w:val="785CF232"/>
@@ -2139,7 +2485,7 @@
       </w:pPr>
     </w:lvl>
   </w:abstractNum>
-  <w:abstractNum w:abstractNumId="23" w15:restartNumberingAfterBreak="0">
+  <w:abstractNum w:abstractNumId="22" w15:restartNumberingAfterBreak="0">
     <w:nsid w:val="57A52794"/>
     <w:multiLevelType w:val="hybridMultilevel"/>
     <w:tmpl w:val="BA5ABE36"/>
@@ -2228,7 +2574,7 @@
       </w:pPr>
     </w:lvl>
   </w:abstractNum>
-  <w:abstractNum w:abstractNumId="24" w15:restartNumberingAfterBreak="0">
+  <w:abstractNum w:abstractNumId="23" w15:restartNumberingAfterBreak="0">
     <w:nsid w:val="5FE35946"/>
     <w:multiLevelType w:val="hybridMultilevel"/>
     <w:tmpl w:val="785CF232"/>
@@ -2317,7 +2663,7 @@
       </w:pPr>
     </w:lvl>
   </w:abstractNum>
-  <w:abstractNum w:abstractNumId="25" w15:restartNumberingAfterBreak="0">
+  <w:abstractNum w:abstractNumId="24" w15:restartNumberingAfterBreak="0">
     <w:nsid w:val="603351E3"/>
     <w:multiLevelType w:val="hybridMultilevel"/>
     <w:tmpl w:val="96B2C9C2"/>
@@ -2407,7 +2753,7 @@
       </w:pPr>
     </w:lvl>
   </w:abstractNum>
-  <w:abstractNum w:abstractNumId="26" w15:restartNumberingAfterBreak="0">
+  <w:abstractNum w:abstractNumId="25" w15:restartNumberingAfterBreak="0">
     <w:nsid w:val="66C43830"/>
     <w:multiLevelType w:val="hybridMultilevel"/>
     <w:tmpl w:val="785CF232"/>
@@ -2496,7 +2842,7 @@
       </w:pPr>
     </w:lvl>
   </w:abstractNum>
-  <w:abstractNum w:abstractNumId="27" w15:restartNumberingAfterBreak="0">
+  <w:abstractNum w:abstractNumId="26" w15:restartNumberingAfterBreak="0">
     <w:nsid w:val="6CA824FA"/>
     <w:multiLevelType w:val="hybridMultilevel"/>
     <w:tmpl w:val="68D8C660"/>
@@ -2585,7 +2931,7 @@
       </w:pPr>
     </w:lvl>
   </w:abstractNum>
-  <w:abstractNum w:abstractNumId="28" w15:restartNumberingAfterBreak="0">
+  <w:abstractNum w:abstractNumId="27" w15:restartNumberingAfterBreak="0">
     <w:nsid w:val="70542362"/>
     <w:multiLevelType w:val="hybridMultilevel"/>
     <w:tmpl w:val="3E9C37F8"/>
@@ -2674,7 +3020,7 @@
       </w:pPr>
     </w:lvl>
   </w:abstractNum>
-  <w:abstractNum w:abstractNumId="29" w15:restartNumberingAfterBreak="0">
+  <w:abstractNum w:abstractNumId="28" w15:restartNumberingAfterBreak="0">
     <w:nsid w:val="75146021"/>
     <w:multiLevelType w:val="hybridMultilevel"/>
     <w:tmpl w:val="AEB619B4"/>
@@ -2763,7 +3109,7 @@
       </w:pPr>
     </w:lvl>
   </w:abstractNum>
-  <w:abstractNum w:abstractNumId="30" w15:restartNumberingAfterBreak="0">
+  <w:abstractNum w:abstractNumId="29" w15:restartNumberingAfterBreak="0">
     <w:nsid w:val="7BE02318"/>
     <w:multiLevelType w:val="hybridMultilevel"/>
     <w:tmpl w:val="3E9C37F8"/>
@@ -2852,7 +3198,7 @@
       </w:pPr>
     </w:lvl>
   </w:abstractNum>
-  <w:abstractNum w:abstractNumId="31" w15:restartNumberingAfterBreak="0">
+  <w:abstractNum w:abstractNumId="30" w15:restartNumberingAfterBreak="0">
     <w:nsid w:val="7E7777FF"/>
     <w:multiLevelType w:val="hybridMultilevel"/>
     <w:tmpl w:val="3E9C37F8"/>
@@ -2942,100 +3288,97 @@
     </w:lvl>
   </w:abstractNum>
   <w:num w:numId="1">
+    <w:abstractNumId w:val="10"/>
+  </w:num>
+  <w:num w:numId="2">
+    <w:abstractNumId w:val="17"/>
+  </w:num>
+  <w:num w:numId="3">
+    <w:abstractNumId w:val="18"/>
+  </w:num>
+  <w:num w:numId="4">
+    <w:abstractNumId w:val="20"/>
+  </w:num>
+  <w:num w:numId="5">
+    <w:abstractNumId w:val="30"/>
+  </w:num>
+  <w:num w:numId="6">
     <w:abstractNumId w:val="11"/>
   </w:num>
-  <w:num w:numId="2">
-    <w:abstractNumId w:val="18"/>
-  </w:num>
-  <w:num w:numId="3">
-    <w:abstractNumId w:val="19"/>
-  </w:num>
-  <w:num w:numId="4">
-    <w:abstractNumId w:val="21"/>
-  </w:num>
-  <w:num w:numId="5">
-    <w:abstractNumId w:val="31"/>
-  </w:num>
-  <w:num w:numId="6">
-    <w:abstractNumId w:val="12"/>
-  </w:num>
   <w:num w:numId="7">
-    <w:abstractNumId w:val="28"/>
+    <w:abstractNumId w:val="27"/>
   </w:num>
   <w:num w:numId="8">
     <w:abstractNumId w:val="1"/>
   </w:num>
   <w:num w:numId="9">
-    <w:abstractNumId w:val="30"/>
+    <w:abstractNumId w:val="29"/>
   </w:num>
   <w:num w:numId="10">
+    <w:abstractNumId w:val="15"/>
+  </w:num>
+  <w:num w:numId="11">
     <w:abstractNumId w:val="16"/>
   </w:num>
-  <w:num w:numId="11">
-    <w:abstractNumId w:val="17"/>
-  </w:num>
   <w:num w:numId="12">
-    <w:abstractNumId w:val="20"/>
+    <w:abstractNumId w:val="19"/>
   </w:num>
   <w:num w:numId="13">
+    <w:abstractNumId w:val="24"/>
+  </w:num>
+  <w:num w:numId="14">
+    <w:abstractNumId w:val="28"/>
+  </w:num>
+  <w:num w:numId="15">
+    <w:abstractNumId w:val="14"/>
+  </w:num>
+  <w:num w:numId="16">
+    <w:abstractNumId w:val="2"/>
+  </w:num>
+  <w:num w:numId="17">
     <w:abstractNumId w:val="25"/>
   </w:num>
-  <w:num w:numId="14">
-    <w:abstractNumId w:val="29"/>
+  <w:num w:numId="18">
+    <w:abstractNumId w:val="8"/>
   </w:num>
-  <w:num w:numId="15">
-    <w:abstractNumId w:val="15"/>
+  <w:num w:numId="19">
+    <w:abstractNumId w:val="21"/>
   </w:num>
-  <w:num w:numId="16">
+  <w:num w:numId="20">
     <w:abstractNumId w:val="3"/>
   </w:num>
-  <w:num w:numId="17">
+  <w:num w:numId="21">
+    <w:abstractNumId w:val="23"/>
+  </w:num>
+  <w:num w:numId="22">
+    <w:abstractNumId w:val="22"/>
+  </w:num>
+  <w:num w:numId="23">
     <w:abstractNumId w:val="26"/>
   </w:num>
-  <w:num w:numId="18">
+  <w:num w:numId="24">
+    <w:abstractNumId w:val="6"/>
+  </w:num>
+  <w:num w:numId="25">
+    <w:abstractNumId w:val="13"/>
+  </w:num>
+  <w:num w:numId="26">
     <w:abstractNumId w:val="9"/>
   </w:num>
-  <w:num w:numId="19">
-    <w:abstractNumId w:val="22"/>
-  </w:num>
-  <w:num w:numId="20">
+  <w:num w:numId="27">
     <w:abstractNumId w:val="4"/>
   </w:num>
-  <w:num w:numId="21">
-    <w:abstractNumId w:val="24"/>
+  <w:num w:numId="28">
+    <w:abstractNumId w:val="12"/>
   </w:num>
-  <w:num w:numId="22">
-    <w:abstractNumId w:val="23"/>
-  </w:num>
-  <w:num w:numId="23">
-    <w:abstractNumId w:val="27"/>
-  </w:num>
-  <w:num w:numId="24">
+  <w:num w:numId="29">
     <w:abstractNumId w:val="7"/>
   </w:num>
-  <w:num w:numId="25">
-    <w:abstractNumId w:val="14"/>
-  </w:num>
-  <w:num w:numId="26">
-    <w:abstractNumId w:val="10"/>
-  </w:num>
-  <w:num w:numId="27">
+  <w:num w:numId="30">
     <w:abstractNumId w:val="5"/>
-  </w:num>
-  <w:num w:numId="28">
-    <w:abstractNumId w:val="13"/>
-  </w:num>
-  <w:num w:numId="29">
-    <w:abstractNumId w:val="8"/>
-  </w:num>
-  <w:num w:numId="30">
-    <w:abstractNumId w:val="6"/>
   </w:num>
   <w:num w:numId="31">
     <w:abstractNumId w:val="0"/>
-  </w:num>
-  <w:num w:numId="32">
-    <w:abstractNumId w:val="2"/>
   </w:num>
   <w:numIdMacAtCleanup w:val="3"/>
 </w:numbering>
@@ -5257,8 +5600,8 @@
     <w:name w:val="stat12"/>
     <w:rsid w:val="00303AEF"/>
   </w:style>
-  <w:style w:type="character" w:customStyle="1" w:styleId="1b">
-    <w:name w:val="Неразрешенное упоминание1"/>
+  <w:style w:type="character" w:styleId="aff">
+    <w:name w:val="Unresolved Mention"/>
     <w:basedOn w:val="a0"/>
     <w:uiPriority w:val="99"/>
     <w:semiHidden/>
@@ -5558,11 +5901,11 @@
 </file>
 
 <file path=customXml/item1.xml><?xml version="1.0" encoding="utf-8"?>
-<b:Sources xmlns:b="http://schemas.openxmlformats.org/officeDocument/2006/bibliography" xmlns="http://schemas.openxmlformats.org/officeDocument/2006/bibliography" SelectedStyle="\APA.XSL" StyleName="APA"/>
+<b:Sources xmlns:b="http://schemas.openxmlformats.org/officeDocument/2006/bibliography" xmlns="http://schemas.openxmlformats.org/officeDocument/2006/bibliography" SelectedStyle="\APA.XSL" StyleName="APA Fifth Edition"/>
 </file>
 
 <file path=customXml/itemProps1.xml><?xml version="1.0" encoding="utf-8"?>
-<ds:datastoreItem xmlns:ds="http://schemas.openxmlformats.org/officeDocument/2006/customXml" ds:itemID="{4FDC9042-074C-49F6-838A-BACBC9CB808A}">
+<ds:datastoreItem xmlns:ds="http://schemas.openxmlformats.org/officeDocument/2006/customXml" ds:itemID="{C4E81A1A-0384-4AB2-B2C7-7287B33D661C}">
   <ds:schemaRefs>
     <ds:schemaRef ds:uri="http://schemas.openxmlformats.org/officeDocument/2006/bibliography"/>
   </ds:schemaRefs>

</xml_diff>